<commit_message>
Tests: don't run Mininet cleanup, it kills the controller
</commit_message>
<xml_diff>
--- a/docs/DESIGN.docx
+++ b/docs/DESIGN.docx
@@ -1007,7 +1007,18 @@
         <w:t xml:space="preserve">sudo mn -c</w:t>
       </w:r>
       <w:r>
-        <w:t xml:space="preserve"> and try again.</w:t>
+        <w:t xml:space="preserve">, start the controller again (</w:t>
+      </w:r>
+      <w:r>
+        <w:rPr>
+          <w:rFonts w:ascii="Consolas" w:cs="Consolas" w:eastAsia="Consolas" w:hAnsi="Consolas"/>
+          <w:sz w:val="20"/>
+          <w:szCs w:val="20"/>
+        </w:rPr>
+        <w:t xml:space="preserve">mn -c</w:t>
+      </w:r>
+      <w:r>
+        <w:t xml:space="preserve"> stops it too), and try again.</w:t>
       </w:r>
     </w:p>
     <w:sectPr>

</xml_diff>

<commit_message>
Design doc: team names, sudo mn -c as the first run step
</commit_message>
<xml_diff>
--- a/docs/DESIGN.docx
+++ b/docs/DESIGN.docx
@@ -23,7 +23,7 @@
         <w:jc w:val="center"/>
       </w:pPr>
       <w:r>
-        <w:t xml:space="preserve">Team: [Name 1, SRN], [Name 2, SRN], [Name 3, SRN]</w:t>
+        <w:t xml:space="preserve">Team: [Aditi Rowjee, PES1UG25CS030], [Seema Haragapuri, PES1UG25], [Aarush, SRN]</w:t>
       </w:r>
     </w:p>
     <w:p>
@@ -316,7 +316,7 @@
           <w:b/>
           <w:bCs/>
         </w:rPr>
-        <w:t xml:space="preserve">Sockets.</w:t>
+        <w:t xml:space="preserve">Sockets:</w:t>
       </w:r>
       <w:r>
         <w:t xml:space="preserve"> The client sends </w:t>
@@ -386,7 +386,7 @@
           <w:b/>
           <w:bCs/>
         </w:rPr>
-        <w:t xml:space="preserve">SDN.</w:t>
+        <w:t xml:space="preserve">SDN:</w:t>
       </w:r>
       <w:r>
         <w:t xml:space="preserve"> The controller answers ARP requests itself (including for 10.0.0.100), so broadcasts don't loop around the square. It learns the topology with LLDP and finds paths with networkx. When a client's first packet to 10.0.0.100:8080 arrives, it picks a server and installs flow rules on the path: the first switch changes the destination to the real server, and the last switch on the way back changes the source back to 10.0.0.100. If a link goes down, the flows are deleted and reinstalled on the other path.</w:t>
@@ -401,7 +401,7 @@
           <w:b/>
           <w:bCs/>
         </w:rPr>
-        <w:t xml:space="preserve">Socket–SDN integration.</w:t>
+        <w:t xml:space="preserve">Socket–SDN integration:</w:t>
       </w:r>
       <w:r>
         <w:t xml:space="preserve"> Every 2 s each server sends a UDP message to the controller with how many clients it is serving. The controller keeps this in </w:t>
@@ -764,7 +764,7 @@
           <w:b/>
           <w:bCs/>
         </w:rPr>
-        <w:t xml:space="preserve">Install Ryu.</w:t>
+        <w:t xml:space="preserve">Install Ryu:</w:t>
       </w:r>
       <w:r>
         <w:t xml:space="preserve"> On Ubuntu 22.04: </w:t>
@@ -846,10 +846,43 @@
           <w:b/>
           <w:bCs/>
         </w:rPr>
-        <w:t xml:space="preserve">Run.</w:t>
-      </w:r>
-      <w:r>
-        <w:t xml:space="preserve"> Start the controller first, in its own terminal (on 24.04 use </w:t>
+        <w:t xml:space="preserve">Run:</w:t>
+      </w:r>
+      <w:r>
+        <w:t xml:space="preserve"> First clear any old Mininet run with </w:t>
+      </w:r>
+      <w:r>
+        <w:rPr>
+          <w:rFonts w:ascii="Consolas" w:cs="Consolas" w:eastAsia="Consolas" w:hAnsi="Consolas"/>
+          <w:sz w:val="20"/>
+          <w:szCs w:val="20"/>
+        </w:rPr>
+        <w:t xml:space="preserve">sudo mn -c</w:t>
+      </w:r>
+      <w:r>
+        <w:t xml:space="preserve"> (this also stops a running controller, so do it before starting one):</w:t>
+      </w:r>
+    </w:p>
+    <w:p>
+      <w:pPr>
+        <w:spacing w:after="100"/>
+        <w:ind w:left="720"/>
+      </w:pPr>
+      <w:r>
+        <w:rPr>
+          <w:rFonts w:ascii="Consolas" w:cs="Consolas" w:eastAsia="Consolas" w:hAnsi="Consolas"/>
+          <w:sz w:val="18"/>
+          <w:szCs w:val="18"/>
+        </w:rPr>
+        <w:t xml:space="preserve">sudo mn -c</w:t>
+      </w:r>
+    </w:p>
+    <w:p>
+      <w:pPr>
+        <w:spacing w:after="100"/>
+      </w:pPr>
+      <w:r>
+        <w:t xml:space="preserve">Then start the controller in its own terminal (on 24.04 use </w:t>
       </w:r>
       <w:r>
         <w:rPr>

</xml_diff>